<commit_message>
Deploiement du site : Assistances AXA (resume + depliant)
Co-Authored-By: Claude Sonnet 5.5 <noreply@anthropic.com>
Claude-Session: https://claude.ai/code/session_01Qy2Wa5ACXajAV16uhKD7cK
</commit_message>
<xml_diff>
--- a/resumes/prevoyance-axa-non-cadre.docx
+++ b/resumes/prevoyance-axa-non-cadre.docx
@@ -1183,7 +1183,21 @@
           <w:b w:val="0"/>
           <w:i w:val="0"/>
         </w:rPr>
-        <w:t>Le document « ICO Information Assistance AXA » décrit un autre contrat d'assistance (n° 2713840) aux limites différentes ; son rattachement à ce régime n'est pas établi.</w:t>
+        <w:t xml:space="preserve">Une autre notice d'information décrit l'ensemble des assistances AXA possibles (contrat n° 2713840), aux limites différentes : voir le </w:t>
+      </w:r>
+      <w:r>
+        <w:rPr>
+          <w:b w:val="0"/>
+          <w:i w:val="0"/>
+        </w:rPr>
+        <w:t>résumé Assistances AXA</w:t>
+      </w:r>
+      <w:r>
+        <w:rPr>
+          <w:b w:val="0"/>
+          <w:i w:val="0"/>
+        </w:rPr>
+        <w:t>.</w:t>
       </w:r>
     </w:p>
     <w:p>

</xml_diff>